<commit_message>
feat: Phase C 综合测试套件 (375 tests, 0 failures)
新增 7 个测试文件，修复 2 个已有测试文件，覆盖全部 12 种实验的：
- 单元测试 (test_db_functions, test_experiment_engine, test_business_record)
- 计算精度/除零/None传播测试 (test_calculations)
- 边界值测试 (test_boundary_values)
- 验证规则与复选框测试 (test_validation)
- 模板字段映射测试 (test_template_mapping)
- 集成流程测试 (test_integration_flows)

同时包含 Phase B 功能增强、R014/R015 模板、bug 修复等。

Co-Authored-By: Claude <noreply@anthropic.com>
</commit_message>
<xml_diff>
--- a/templates/RECORD_R006_WARPAGE.docx
+++ b/templates/RECORD_R006_WARPAGE.docx
@@ -1389,7 +1389,7 @@
                 <w:rtl w:val="0"/>
                 <w:lang w:val="en-US"/>
               </w:rPr>
-              <w:t>报告编号</w:t>
+              <w:t>原始记录编号</w:t>
             </w:r>
           </w:p>
         </w:tc>
@@ -30120,7 +30120,7 @@
           <w:color w:val="auto"/>
           <w:rtl w:val="0"/>
         </w:rPr>
-        <w:t xml:space="preserve">4. </w:t>
+        <w:t>4. 所有原始图像、测量截图、数据文件和原始记录编号应保持唯一对应关系，满足可追溯要求。</w:t>
       </w:r>
       <w:r>
         <w:rPr>
@@ -30129,7 +30129,6 @@
           <w:rtl w:val="0"/>
           <w:lang w:val="en-US"/>
         </w:rPr>
-        <w:t>所有原始图像、测量截图、数据文件和报告编号应保持唯一对应关系，满足可追溯要求。</w:t>
       </w:r>
     </w:p>
     <w:sectPr>

</xml_diff>